<commit_message>
CASE PROFILE template v5.11: add Prosecution Theory section, expand Seized Property to 9 columns
Completes the v5.11 migration for the Case Profile template:
- New Part 1 Section 1 (Prosecution Theory of the Case): banner, red header
  note, and the five bolded sub-heads as scaffolding.
- Seized Property / Devices table expanded 7 to 9 columns (adds Evidence
  ID / PR# after Item, and Owner Basis after Owner); widths rebalanced.
- Part 1 section banners renumbered 1-11; Parts 2A/2B/2C untouched.

Co-Authored-By: Claude Opus 4.8 <noreply@anthropic.com>
Claude-Session: https://claude.ai/code/session_01W9BBy74pewPCentcdtH3KQ
</commit_message>
<xml_diff>
--- a/dw-core/skills/dw-criminal-defense-crim/assets/CASE PROFILE.docx
+++ b/dw-core/skills/dw-criminal-defense-crim/assets/CASE PROFILE.docx
@@ -68,7 +68,128 @@
                 <w:color w:val="FFFFFF"/>
                 <w:sz w:val="26"/>
               </w:rPr>
-              <w:t>Section 1 — Case Identification</w:t>
+              <w:t>Section 1 — Prosecution's Theory of the Case</w:t>
+            </w:r>
+          </w:p>
+        </w:tc>
+      </w:tr>
+    </w:tbl>
+    <w:p>
+      <w:pPr>
+        <w:spacing w:after="120" w:before="120"/>
+      </w:pPr>
+      <w:r>
+        <w:rPr>
+          <w:rFonts w:ascii="Calibri" w:hAnsi="Calibri"/>
+          <w:i/>
+          <w:color w:val="C62828"/>
+          <w:sz w:val="22"/>
+        </w:rPr>
+        <w:t xml:space="preserve">Draft synopsis of the State's position, for defense use — not an admission of any fact. Every factual assertion carries a discovery cite; attribution, not adoption.</w:t>
+      </w:r>
+    </w:p>
+    <w:p>
+      <w:pPr>
+        <w:spacing w:after="120" w:before="240"/>
+      </w:pPr>
+      <w:r>
+        <w:rPr>
+          <w:rFonts w:ascii="Calibri" w:hAnsi="Calibri"/>
+          <w:b/>
+          <w:color w:val="C62828"/>
+          <w:sz w:val="24"/>
+        </w:rPr>
+        <w:t xml:space="preserve">Charge &amp; forum</w:t>
+      </w:r>
+    </w:p>
+    <w:p/>
+    <w:p>
+      <w:pPr>
+        <w:spacing w:after="120" w:before="240"/>
+      </w:pPr>
+      <w:r>
+        <w:rPr>
+          <w:rFonts w:ascii="Calibri" w:hAnsi="Calibri"/>
+          <w:b/>
+          <w:color w:val="C62828"/>
+          <w:sz w:val="24"/>
+        </w:rPr>
+        <w:t xml:space="preserve">The State's narrative of the offense</w:t>
+      </w:r>
+    </w:p>
+    <w:p/>
+    <w:p>
+      <w:pPr>
+        <w:spacing w:after="120" w:before="240"/>
+      </w:pPr>
+      <w:r>
+        <w:rPr>
+          <w:rFonts w:ascii="Calibri" w:hAnsi="Calibri"/>
+          <w:b/>
+          <w:color w:val="C62828"/>
+          <w:sz w:val="24"/>
+        </w:rPr>
+        <w:t xml:space="preserve">Theory of guilt</w:t>
+      </w:r>
+    </w:p>
+    <w:p/>
+    <w:p>
+      <w:pPr>
+        <w:spacing w:after="120" w:before="240"/>
+      </w:pPr>
+      <w:r>
+        <w:rPr>
+          <w:rFonts w:ascii="Calibri" w:hAnsi="Calibri"/>
+          <w:b/>
+          <w:color w:val="C62828"/>
+          <w:sz w:val="24"/>
+        </w:rPr>
+        <w:t xml:space="preserve">Key proof the State will rely on</w:t>
+      </w:r>
+    </w:p>
+    <w:p/>
+    <w:p>
+      <w:pPr>
+        <w:spacing w:after="120" w:before="240"/>
+      </w:pPr>
+      <w:r>
+        <w:rPr>
+          <w:rFonts w:ascii="Calibri" w:hAnsi="Calibri"/>
+          <w:b/>
+          <w:color w:val="C62828"/>
+          <w:sz w:val="24"/>
+        </w:rPr>
+        <w:t xml:space="preserve">Apparent weak points in the State's proof</w:t>
+      </w:r>
+    </w:p>
+    <w:p/>
+    <w:p/>
+    <w:tbl>
+      <w:tblPr>
+        <w:tblW w:type="auto" w:w="0"/>
+        <w:tblLayout w:type="fixed"/>
+        <w:tblLook w:firstColumn="1" w:firstRow="1" w:lastColumn="0" w:lastRow="0" w:noHBand="0" w:noVBand="1" w:val="04A0"/>
+      </w:tblPr>
+      <w:tblGrid>
+        <w:gridCol w:w="9360"/>
+      </w:tblGrid>
+      <w:tr>
+        <w:tc>
+          <w:tcPr>
+            <w:tcW w:type="dxa" w:w="9360"/>
+            <w:shd w:fill="607D8B"/>
+          </w:tcPr>
+          <w:p>
+            <w:pPr>
+              <w:jc w:val="center"/>
+            </w:pPr>
+            <w:r>
+              <w:rPr>
+                <w:b/>
+                <w:color w:val="FFFFFF"/>
+                <w:sz w:val="26"/>
+              </w:rPr>
+              <w:t>Section 2 — Case Identification</w:t>
             </w:r>
           </w:p>
         </w:tc>
@@ -1348,18 +1469,20 @@
         <w:tblLook w:firstColumn="1" w:firstRow="1" w:lastColumn="0" w:lastRow="0" w:noHBand="0" w:noVBand="1" w:val="04A0"/>
       </w:tblPr>
       <w:tblGrid>
-        <w:gridCol w:w="1500"/>
-        <w:gridCol w:w="900"/>
-        <w:gridCol w:w="1500"/>
-        <w:gridCol w:w="900"/>
-        <w:gridCol w:w="1200"/>
-        <w:gridCol w:w="1200"/>
-        <w:gridCol w:w="2160"/>
+        <w:gridCol w:w="1150"/>
+        <w:gridCol w:w="1040"/>
+        <w:gridCol w:w="820"/>
+        <w:gridCol w:w="1300"/>
+        <w:gridCol w:w="1250"/>
+        <w:gridCol w:w="820"/>
+        <w:gridCol w:w="1040"/>
+        <w:gridCol w:w="1080"/>
+        <w:gridCol w:w="860"/>
       </w:tblGrid>
       <w:tr>
         <w:tc>
           <w:tcPr>
-            <w:tcW w:type="dxa" w:w="1500"/>
+            <w:tcW w:type="dxa" w:w="1150"/>
             <w:tcBorders>
               <w:top w:color="999999" w:space="0" w:sz="4" w:val="single"/>
               <w:left w:color="999999" w:space="0" w:sz="4" w:val="single"/>
@@ -1378,13 +1501,13 @@
                 <w:b/>
                 <w:sz w:val="22"/>
               </w:rPr>
-              <w:t>Item</w:t>
+              <w:t xml:space="preserve">Item</w:t>
             </w:r>
           </w:p>
         </w:tc>
         <w:tc>
           <w:tcPr>
-            <w:tcW w:type="dxa" w:w="900"/>
+            <w:tcW w:type="dxa" w:w="1040"/>
             <w:tcBorders>
               <w:top w:color="999999" w:space="0" w:sz="4" w:val="single"/>
               <w:left w:color="999999" w:space="0" w:sz="4" w:val="single"/>
@@ -1403,13 +1526,13 @@
                 <w:b/>
                 <w:sz w:val="22"/>
               </w:rPr>
-              <w:t>Owner</w:t>
+              <w:t xml:space="preserve">Evidence ID / PR#</w:t>
             </w:r>
           </w:p>
         </w:tc>
         <w:tc>
           <w:tcPr>
-            <w:tcW w:type="dxa" w:w="1500"/>
+            <w:tcW w:type="dxa" w:w="820"/>
             <w:tcBorders>
               <w:top w:color="999999" w:space="0" w:sz="4" w:val="single"/>
               <w:left w:color="999999" w:space="0" w:sz="4" w:val="single"/>
@@ -1428,13 +1551,13 @@
                 <w:b/>
                 <w:sz w:val="22"/>
               </w:rPr>
-              <w:t>Seized From</w:t>
+              <w:t xml:space="preserve">Owner</w:t>
             </w:r>
           </w:p>
         </w:tc>
         <w:tc>
           <w:tcPr>
-            <w:tcW w:type="dxa" w:w="900"/>
+            <w:tcW w:type="dxa" w:w="1300"/>
             <w:tcBorders>
               <w:top w:color="999999" w:space="0" w:sz="4" w:val="single"/>
               <w:left w:color="999999" w:space="0" w:sz="4" w:val="single"/>
@@ -1453,13 +1576,13 @@
                 <w:b/>
                 <w:sz w:val="22"/>
               </w:rPr>
-              <w:t>Date Seized</w:t>
+              <w:t xml:space="preserve">Owner Basis</w:t>
             </w:r>
           </w:p>
         </w:tc>
         <w:tc>
           <w:tcPr>
-            <w:tcW w:type="dxa" w:w="1200"/>
+            <w:tcW w:type="dxa" w:w="1250"/>
             <w:tcBorders>
               <w:top w:color="999999" w:space="0" w:sz="4" w:val="single"/>
               <w:left w:color="999999" w:space="0" w:sz="4" w:val="single"/>
@@ -1478,13 +1601,13 @@
                 <w:b/>
                 <w:sz w:val="22"/>
               </w:rPr>
-              <w:t>Warrant # / Bate</w:t>
+              <w:t xml:space="preserve">Seized From</w:t>
             </w:r>
           </w:p>
         </w:tc>
         <w:tc>
           <w:tcPr>
-            <w:tcW w:type="dxa" w:w="1200"/>
+            <w:tcW w:type="dxa" w:w="820"/>
             <w:tcBorders>
               <w:top w:color="999999" w:space="0" w:sz="4" w:val="single"/>
               <w:left w:color="999999" w:space="0" w:sz="4" w:val="single"/>
@@ -1503,13 +1626,13 @@
                 <w:b/>
                 <w:sz w:val="22"/>
               </w:rPr>
-              <w:t>Extraction Status</w:t>
+              <w:t xml:space="preserve">Date Seized</w:t>
             </w:r>
           </w:p>
         </w:tc>
         <w:tc>
           <w:tcPr>
-            <w:tcW w:type="dxa" w:w="2160"/>
+            <w:tcW w:type="dxa" w:w="1040"/>
             <w:tcBorders>
               <w:top w:color="999999" w:space="0" w:sz="4" w:val="single"/>
               <w:left w:color="999999" w:space="0" w:sz="4" w:val="single"/>
@@ -1528,41 +1651,65 @@
                 <w:b/>
                 <w:sz w:val="22"/>
               </w:rPr>
-              <w:t>Notes</w:t>
+              <w:t xml:space="preserve">Warrant # / Bate</w:t>
             </w:r>
           </w:p>
         </w:tc>
-      </w:tr>
-      <w:tr>
-        <w:tc>
-          <w:tcPr>
-            <w:tcW w:type="dxa" w:w="1500"/>
+        <w:tc>
+          <w:tcPr>
+            <w:tcW w:type="dxa" w:w="1080"/>
             <w:tcBorders>
               <w:top w:color="999999" w:space="0" w:sz="4" w:val="single"/>
               <w:left w:color="999999" w:space="0" w:sz="4" w:val="single"/>
               <w:bottom w:color="999999" w:space="0" w:sz="4" w:val="single"/>
               <w:right w:color="999999" w:space="0" w:sz="4" w:val="single"/>
             </w:tcBorders>
-            <w:shd w:fill="FFFFFF"/>
-          </w:tcPr>
-          <w:p/>
-        </w:tc>
-        <w:tc>
-          <w:tcPr>
-            <w:tcW w:type="dxa" w:w="900"/>
+            <w:shd w:fill="F5F5F5"/>
+          </w:tcPr>
+          <w:p>
+            <w:pPr>
+              <w:jc w:val="center"/>
+            </w:pPr>
+            <w:r>
+              <w:rPr>
+                <w:rFonts w:ascii="Calibri" w:hAnsi="Calibri"/>
+                <w:b/>
+                <w:sz w:val="22"/>
+              </w:rPr>
+              <w:t xml:space="preserve">Extraction Status</w:t>
+            </w:r>
+          </w:p>
+        </w:tc>
+        <w:tc>
+          <w:tcPr>
+            <w:tcW w:type="dxa" w:w="860"/>
             <w:tcBorders>
               <w:top w:color="999999" w:space="0" w:sz="4" w:val="single"/>
               <w:left w:color="999999" w:space="0" w:sz="4" w:val="single"/>
               <w:bottom w:color="999999" w:space="0" w:sz="4" w:val="single"/>
               <w:right w:color="999999" w:space="0" w:sz="4" w:val="single"/>
             </w:tcBorders>
-            <w:shd w:fill="FFFFFF"/>
-          </w:tcPr>
-          <w:p/>
-        </w:tc>
-        <w:tc>
-          <w:tcPr>
-            <w:tcW w:type="dxa" w:w="1500"/>
+            <w:shd w:fill="F5F5F5"/>
+          </w:tcPr>
+          <w:p>
+            <w:pPr>
+              <w:jc w:val="center"/>
+            </w:pPr>
+            <w:r>
+              <w:rPr>
+                <w:rFonts w:ascii="Calibri" w:hAnsi="Calibri"/>
+                <w:b/>
+                <w:sz w:val="22"/>
+              </w:rPr>
+              <w:t xml:space="preserve">Notes</w:t>
+            </w:r>
+          </w:p>
+        </w:tc>
+      </w:tr>
+      <w:tr>
+        <w:tc>
+          <w:tcPr>
+            <w:tcW w:type="dxa" w:w="1150"/>
             <w:tcBorders>
               <w:top w:color="999999" w:space="0" w:sz="4" w:val="single"/>
               <w:left w:color="999999" w:space="0" w:sz="4" w:val="single"/>
@@ -1575,7 +1722,7 @@
         </w:tc>
         <w:tc>
           <w:tcPr>
-            <w:tcW w:type="dxa" w:w="900"/>
+            <w:tcW w:type="dxa" w:w="1040"/>
             <w:tcBorders>
               <w:top w:color="999999" w:space="0" w:sz="4" w:val="single"/>
               <w:left w:color="999999" w:space="0" w:sz="4" w:val="single"/>
@@ -1588,7 +1735,7 @@
         </w:tc>
         <w:tc>
           <w:tcPr>
-            <w:tcW w:type="dxa" w:w="1200"/>
+            <w:tcW w:type="dxa" w:w="820"/>
             <w:tcBorders>
               <w:top w:color="999999" w:space="0" w:sz="4" w:val="single"/>
               <w:left w:color="999999" w:space="0" w:sz="4" w:val="single"/>
@@ -1601,7 +1748,7 @@
         </w:tc>
         <w:tc>
           <w:tcPr>
-            <w:tcW w:type="dxa" w:w="1200"/>
+            <w:tcW w:type="dxa" w:w="1300"/>
             <w:tcBorders>
               <w:top w:color="999999" w:space="0" w:sz="4" w:val="single"/>
               <w:left w:color="999999" w:space="0" w:sz="4" w:val="single"/>
@@ -1614,7 +1761,7 @@
         </w:tc>
         <w:tc>
           <w:tcPr>
-            <w:tcW w:type="dxa" w:w="2160"/>
+            <w:tcW w:type="dxa" w:w="1250"/>
             <w:tcBorders>
               <w:top w:color="999999" w:space="0" w:sz="4" w:val="single"/>
               <w:left w:color="999999" w:space="0" w:sz="4" w:val="single"/>
@@ -1625,11 +1772,9 @@
           </w:tcPr>
           <w:p/>
         </w:tc>
-      </w:tr>
-      <w:tr>
-        <w:tc>
-          <w:tcPr>
-            <w:tcW w:type="dxa" w:w="1500"/>
+        <w:tc>
+          <w:tcPr>
+            <w:tcW w:type="dxa" w:w="820"/>
             <w:tcBorders>
               <w:top w:color="999999" w:space="0" w:sz="4" w:val="single"/>
               <w:left w:color="999999" w:space="0" w:sz="4" w:val="single"/>
@@ -1642,7 +1787,7 @@
         </w:tc>
         <w:tc>
           <w:tcPr>
-            <w:tcW w:type="dxa" w:w="900"/>
+            <w:tcW w:type="dxa" w:w="1040"/>
             <w:tcBorders>
               <w:top w:color="999999" w:space="0" w:sz="4" w:val="single"/>
               <w:left w:color="999999" w:space="0" w:sz="4" w:val="single"/>
@@ -1655,7 +1800,7 @@
         </w:tc>
         <w:tc>
           <w:tcPr>
-            <w:tcW w:type="dxa" w:w="1500"/>
+            <w:tcW w:type="dxa" w:w="1080"/>
             <w:tcBorders>
               <w:top w:color="999999" w:space="0" w:sz="4" w:val="single"/>
               <w:left w:color="999999" w:space="0" w:sz="4" w:val="single"/>
@@ -1668,7 +1813,7 @@
         </w:tc>
         <w:tc>
           <w:tcPr>
-            <w:tcW w:type="dxa" w:w="900"/>
+            <w:tcW w:type="dxa" w:w="860"/>
             <w:tcBorders>
               <w:top w:color="999999" w:space="0" w:sz="4" w:val="single"/>
               <w:left w:color="999999" w:space="0" w:sz="4" w:val="single"/>
@@ -1679,9 +1824,11 @@
           </w:tcPr>
           <w:p/>
         </w:tc>
-        <w:tc>
-          <w:tcPr>
-            <w:tcW w:type="dxa" w:w="1200"/>
+      </w:tr>
+      <w:tr>
+        <w:tc>
+          <w:tcPr>
+            <w:tcW w:type="dxa" w:w="1150"/>
             <w:tcBorders>
               <w:top w:color="999999" w:space="0" w:sz="4" w:val="single"/>
               <w:left w:color="999999" w:space="0" w:sz="4" w:val="single"/>
@@ -1694,7 +1841,7 @@
         </w:tc>
         <w:tc>
           <w:tcPr>
-            <w:tcW w:type="dxa" w:w="1200"/>
+            <w:tcW w:type="dxa" w:w="1040"/>
             <w:tcBorders>
               <w:top w:color="999999" w:space="0" w:sz="4" w:val="single"/>
               <w:left w:color="999999" w:space="0" w:sz="4" w:val="single"/>
@@ -1707,7 +1854,7 @@
         </w:tc>
         <w:tc>
           <w:tcPr>
-            <w:tcW w:type="dxa" w:w="2160"/>
+            <w:tcW w:type="dxa" w:w="820"/>
             <w:tcBorders>
               <w:top w:color="999999" w:space="0" w:sz="4" w:val="single"/>
               <w:left w:color="999999" w:space="0" w:sz="4" w:val="single"/>
@@ -1718,11 +1865,9 @@
           </w:tcPr>
           <w:p/>
         </w:tc>
-      </w:tr>
-      <w:tr>
-        <w:tc>
-          <w:tcPr>
-            <w:tcW w:type="dxa" w:w="1500"/>
+        <w:tc>
+          <w:tcPr>
+            <w:tcW w:type="dxa" w:w="1300"/>
             <w:tcBorders>
               <w:top w:color="999999" w:space="0" w:sz="4" w:val="single"/>
               <w:left w:color="999999" w:space="0" w:sz="4" w:val="single"/>
@@ -1735,7 +1880,7 @@
         </w:tc>
         <w:tc>
           <w:tcPr>
-            <w:tcW w:type="dxa" w:w="900"/>
+            <w:tcW w:type="dxa" w:w="1250"/>
             <w:tcBorders>
               <w:top w:color="999999" w:space="0" w:sz="4" w:val="single"/>
               <w:left w:color="999999" w:space="0" w:sz="4" w:val="single"/>
@@ -1748,7 +1893,7 @@
         </w:tc>
         <w:tc>
           <w:tcPr>
-            <w:tcW w:type="dxa" w:w="1500"/>
+            <w:tcW w:type="dxa" w:w="820"/>
             <w:tcBorders>
               <w:top w:color="999999" w:space="0" w:sz="4" w:val="single"/>
               <w:left w:color="999999" w:space="0" w:sz="4" w:val="single"/>
@@ -1761,7 +1906,7 @@
         </w:tc>
         <w:tc>
           <w:tcPr>
-            <w:tcW w:type="dxa" w:w="900"/>
+            <w:tcW w:type="dxa" w:w="1040"/>
             <w:tcBorders>
               <w:top w:color="999999" w:space="0" w:sz="4" w:val="single"/>
               <w:left w:color="999999" w:space="0" w:sz="4" w:val="single"/>
@@ -1774,7 +1919,7 @@
         </w:tc>
         <w:tc>
           <w:tcPr>
-            <w:tcW w:type="dxa" w:w="1200"/>
+            <w:tcW w:type="dxa" w:w="1080"/>
             <w:tcBorders>
               <w:top w:color="999999" w:space="0" w:sz="4" w:val="single"/>
               <w:left w:color="999999" w:space="0" w:sz="4" w:val="single"/>
@@ -1787,7 +1932,7 @@
         </w:tc>
         <w:tc>
           <w:tcPr>
-            <w:tcW w:type="dxa" w:w="1200"/>
+            <w:tcW w:type="dxa" w:w="860"/>
             <w:tcBorders>
               <w:top w:color="999999" w:space="0" w:sz="4" w:val="single"/>
               <w:left w:color="999999" w:space="0" w:sz="4" w:val="single"/>
@@ -1798,9 +1943,11 @@
           </w:tcPr>
           <w:p/>
         </w:tc>
-        <w:tc>
-          <w:tcPr>
-            <w:tcW w:type="dxa" w:w="2160"/>
+      </w:tr>
+      <w:tr>
+        <w:tc>
+          <w:tcPr>
+            <w:tcW w:type="dxa" w:w="1150"/>
             <w:tcBorders>
               <w:top w:color="999999" w:space="0" w:sz="4" w:val="single"/>
               <w:left w:color="999999" w:space="0" w:sz="4" w:val="single"/>
@@ -1811,11 +1958,9 @@
           </w:tcPr>
           <w:p/>
         </w:tc>
-      </w:tr>
-      <w:tr>
-        <w:tc>
-          <w:tcPr>
-            <w:tcW w:type="dxa" w:w="1500"/>
+        <w:tc>
+          <w:tcPr>
+            <w:tcW w:type="dxa" w:w="1040"/>
             <w:tcBorders>
               <w:top w:color="999999" w:space="0" w:sz="4" w:val="single"/>
               <w:left w:color="999999" w:space="0" w:sz="4" w:val="single"/>
@@ -1828,7 +1973,7 @@
         </w:tc>
         <w:tc>
           <w:tcPr>
-            <w:tcW w:type="dxa" w:w="900"/>
+            <w:tcW w:type="dxa" w:w="820"/>
             <w:tcBorders>
               <w:top w:color="999999" w:space="0" w:sz="4" w:val="single"/>
               <w:left w:color="999999" w:space="0" w:sz="4" w:val="single"/>
@@ -1841,7 +1986,7 @@
         </w:tc>
         <w:tc>
           <w:tcPr>
-            <w:tcW w:type="dxa" w:w="1500"/>
+            <w:tcW w:type="dxa" w:w="1300"/>
             <w:tcBorders>
               <w:top w:color="999999" w:space="0" w:sz="4" w:val="single"/>
               <w:left w:color="999999" w:space="0" w:sz="4" w:val="single"/>
@@ -1854,7 +1999,7 @@
         </w:tc>
         <w:tc>
           <w:tcPr>
-            <w:tcW w:type="dxa" w:w="900"/>
+            <w:tcW w:type="dxa" w:w="1250"/>
             <w:tcBorders>
               <w:top w:color="999999" w:space="0" w:sz="4" w:val="single"/>
               <w:left w:color="999999" w:space="0" w:sz="4" w:val="single"/>
@@ -1867,7 +2012,7 @@
         </w:tc>
         <w:tc>
           <w:tcPr>
-            <w:tcW w:type="dxa" w:w="1200"/>
+            <w:tcW w:type="dxa" w:w="820"/>
             <w:tcBorders>
               <w:top w:color="999999" w:space="0" w:sz="4" w:val="single"/>
               <w:left w:color="999999" w:space="0" w:sz="4" w:val="single"/>
@@ -1880,7 +2025,7 @@
         </w:tc>
         <w:tc>
           <w:tcPr>
-            <w:tcW w:type="dxa" w:w="1200"/>
+            <w:tcW w:type="dxa" w:w="1040"/>
             <w:tcBorders>
               <w:top w:color="999999" w:space="0" w:sz="4" w:val="single"/>
               <w:left w:color="999999" w:space="0" w:sz="4" w:val="single"/>
@@ -1893,7 +2038,7 @@
         </w:tc>
         <w:tc>
           <w:tcPr>
-            <w:tcW w:type="dxa" w:w="2160"/>
+            <w:tcW w:type="dxa" w:w="1080"/>
             <w:tcBorders>
               <w:top w:color="999999" w:space="0" w:sz="4" w:val="single"/>
               <w:left w:color="999999" w:space="0" w:sz="4" w:val="single"/>
@@ -1904,11 +2049,9 @@
           </w:tcPr>
           <w:p/>
         </w:tc>
-      </w:tr>
-      <w:tr>
-        <w:tc>
-          <w:tcPr>
-            <w:tcW w:type="dxa" w:w="1500"/>
+        <w:tc>
+          <w:tcPr>
+            <w:tcW w:type="dxa" w:w="860"/>
             <w:tcBorders>
               <w:top w:color="999999" w:space="0" w:sz="4" w:val="single"/>
               <w:left w:color="999999" w:space="0" w:sz="4" w:val="single"/>
@@ -1919,9 +2062,11 @@
           </w:tcPr>
           <w:p/>
         </w:tc>
-        <w:tc>
-          <w:tcPr>
-            <w:tcW w:type="dxa" w:w="900"/>
+      </w:tr>
+      <w:tr>
+        <w:tc>
+          <w:tcPr>
+            <w:tcW w:type="dxa" w:w="1150"/>
             <w:tcBorders>
               <w:top w:color="999999" w:space="0" w:sz="4" w:val="single"/>
               <w:left w:color="999999" w:space="0" w:sz="4" w:val="single"/>
@@ -1934,7 +2079,7 @@
         </w:tc>
         <w:tc>
           <w:tcPr>
-            <w:tcW w:type="dxa" w:w="1500"/>
+            <w:tcW w:type="dxa" w:w="1040"/>
             <w:tcBorders>
               <w:top w:color="999999" w:space="0" w:sz="4" w:val="single"/>
               <w:left w:color="999999" w:space="0" w:sz="4" w:val="single"/>
@@ -1947,7 +2092,7 @@
         </w:tc>
         <w:tc>
           <w:tcPr>
-            <w:tcW w:type="dxa" w:w="900"/>
+            <w:tcW w:type="dxa" w:w="820"/>
             <w:tcBorders>
               <w:top w:color="999999" w:space="0" w:sz="4" w:val="single"/>
               <w:left w:color="999999" w:space="0" w:sz="4" w:val="single"/>
@@ -1960,7 +2105,7 @@
         </w:tc>
         <w:tc>
           <w:tcPr>
-            <w:tcW w:type="dxa" w:w="1200"/>
+            <w:tcW w:type="dxa" w:w="1300"/>
             <w:tcBorders>
               <w:top w:color="999999" w:space="0" w:sz="4" w:val="single"/>
               <w:left w:color="999999" w:space="0" w:sz="4" w:val="single"/>
@@ -1973,7 +2118,7 @@
         </w:tc>
         <w:tc>
           <w:tcPr>
-            <w:tcW w:type="dxa" w:w="1200"/>
+            <w:tcW w:type="dxa" w:w="1250"/>
             <w:tcBorders>
               <w:top w:color="999999" w:space="0" w:sz="4" w:val="single"/>
               <w:left w:color="999999" w:space="0" w:sz="4" w:val="single"/>
@@ -1986,7 +2131,7 @@
         </w:tc>
         <w:tc>
           <w:tcPr>
-            <w:tcW w:type="dxa" w:w="2160"/>
+            <w:tcW w:type="dxa" w:w="820"/>
             <w:tcBorders>
               <w:top w:color="999999" w:space="0" w:sz="4" w:val="single"/>
               <w:left w:color="999999" w:space="0" w:sz="4" w:val="single"/>
@@ -1997,11 +2142,9 @@
           </w:tcPr>
           <w:p/>
         </w:tc>
-      </w:tr>
-      <w:tr>
-        <w:tc>
-          <w:tcPr>
-            <w:tcW w:type="dxa" w:w="1500"/>
+        <w:tc>
+          <w:tcPr>
+            <w:tcW w:type="dxa" w:w="1040"/>
             <w:tcBorders>
               <w:top w:color="999999" w:space="0" w:sz="4" w:val="single"/>
               <w:left w:color="999999" w:space="0" w:sz="4" w:val="single"/>
@@ -2014,7 +2157,7 @@
         </w:tc>
         <w:tc>
           <w:tcPr>
-            <w:tcW w:type="dxa" w:w="900"/>
+            <w:tcW w:type="dxa" w:w="1080"/>
             <w:tcBorders>
               <w:top w:color="999999" w:space="0" w:sz="4" w:val="single"/>
               <w:left w:color="999999" w:space="0" w:sz="4" w:val="single"/>
@@ -2027,7 +2170,7 @@
         </w:tc>
         <w:tc>
           <w:tcPr>
-            <w:tcW w:type="dxa" w:w="1500"/>
+            <w:tcW w:type="dxa" w:w="860"/>
             <w:tcBorders>
               <w:top w:color="999999" w:space="0" w:sz="4" w:val="single"/>
               <w:left w:color="999999" w:space="0" w:sz="4" w:val="single"/>
@@ -2038,9 +2181,11 @@
           </w:tcPr>
           <w:p/>
         </w:tc>
-        <w:tc>
-          <w:tcPr>
-            <w:tcW w:type="dxa" w:w="900"/>
+      </w:tr>
+      <w:tr>
+        <w:tc>
+          <w:tcPr>
+            <w:tcW w:type="dxa" w:w="1150"/>
             <w:tcBorders>
               <w:top w:color="999999" w:space="0" w:sz="4" w:val="single"/>
               <w:left w:color="999999" w:space="0" w:sz="4" w:val="single"/>
@@ -2053,7 +2198,7 @@
         </w:tc>
         <w:tc>
           <w:tcPr>
-            <w:tcW w:type="dxa" w:w="1200"/>
+            <w:tcW w:type="dxa" w:w="1040"/>
             <w:tcBorders>
               <w:top w:color="999999" w:space="0" w:sz="4" w:val="single"/>
               <w:left w:color="999999" w:space="0" w:sz="4" w:val="single"/>
@@ -2066,7 +2211,7 @@
         </w:tc>
         <w:tc>
           <w:tcPr>
-            <w:tcW w:type="dxa" w:w="1200"/>
+            <w:tcW w:type="dxa" w:w="820"/>
             <w:tcBorders>
               <w:top w:color="999999" w:space="0" w:sz="4" w:val="single"/>
               <w:left w:color="999999" w:space="0" w:sz="4" w:val="single"/>
@@ -2079,7 +2224,191 @@
         </w:tc>
         <w:tc>
           <w:tcPr>
-            <w:tcW w:type="dxa" w:w="2160"/>
+            <w:tcW w:type="dxa" w:w="1300"/>
+            <w:tcBorders>
+              <w:top w:color="999999" w:space="0" w:sz="4" w:val="single"/>
+              <w:left w:color="999999" w:space="0" w:sz="4" w:val="single"/>
+              <w:bottom w:color="999999" w:space="0" w:sz="4" w:val="single"/>
+              <w:right w:color="999999" w:space="0" w:sz="4" w:val="single"/>
+            </w:tcBorders>
+            <w:shd w:fill="FFFFFF"/>
+          </w:tcPr>
+          <w:p/>
+        </w:tc>
+        <w:tc>
+          <w:tcPr>
+            <w:tcW w:type="dxa" w:w="1250"/>
+            <w:tcBorders>
+              <w:top w:color="999999" w:space="0" w:sz="4" w:val="single"/>
+              <w:left w:color="999999" w:space="0" w:sz="4" w:val="single"/>
+              <w:bottom w:color="999999" w:space="0" w:sz="4" w:val="single"/>
+              <w:right w:color="999999" w:space="0" w:sz="4" w:val="single"/>
+            </w:tcBorders>
+            <w:shd w:fill="FFFFFF"/>
+          </w:tcPr>
+          <w:p/>
+        </w:tc>
+        <w:tc>
+          <w:tcPr>
+            <w:tcW w:type="dxa" w:w="820"/>
+            <w:tcBorders>
+              <w:top w:color="999999" w:space="0" w:sz="4" w:val="single"/>
+              <w:left w:color="999999" w:space="0" w:sz="4" w:val="single"/>
+              <w:bottom w:color="999999" w:space="0" w:sz="4" w:val="single"/>
+              <w:right w:color="999999" w:space="0" w:sz="4" w:val="single"/>
+            </w:tcBorders>
+            <w:shd w:fill="FFFFFF"/>
+          </w:tcPr>
+          <w:p/>
+        </w:tc>
+        <w:tc>
+          <w:tcPr>
+            <w:tcW w:type="dxa" w:w="1040"/>
+            <w:tcBorders>
+              <w:top w:color="999999" w:space="0" w:sz="4" w:val="single"/>
+              <w:left w:color="999999" w:space="0" w:sz="4" w:val="single"/>
+              <w:bottom w:color="999999" w:space="0" w:sz="4" w:val="single"/>
+              <w:right w:color="999999" w:space="0" w:sz="4" w:val="single"/>
+            </w:tcBorders>
+            <w:shd w:fill="FFFFFF"/>
+          </w:tcPr>
+          <w:p/>
+        </w:tc>
+        <w:tc>
+          <w:tcPr>
+            <w:tcW w:type="dxa" w:w="1080"/>
+            <w:tcBorders>
+              <w:top w:color="999999" w:space="0" w:sz="4" w:val="single"/>
+              <w:left w:color="999999" w:space="0" w:sz="4" w:val="single"/>
+              <w:bottom w:color="999999" w:space="0" w:sz="4" w:val="single"/>
+              <w:right w:color="999999" w:space="0" w:sz="4" w:val="single"/>
+            </w:tcBorders>
+            <w:shd w:fill="FFFFFF"/>
+          </w:tcPr>
+          <w:p/>
+        </w:tc>
+        <w:tc>
+          <w:tcPr>
+            <w:tcW w:type="dxa" w:w="860"/>
+            <w:tcBorders>
+              <w:top w:color="999999" w:space="0" w:sz="4" w:val="single"/>
+              <w:left w:color="999999" w:space="0" w:sz="4" w:val="single"/>
+              <w:bottom w:color="999999" w:space="0" w:sz="4" w:val="single"/>
+              <w:right w:color="999999" w:space="0" w:sz="4" w:val="single"/>
+            </w:tcBorders>
+            <w:shd w:fill="FFFFFF"/>
+          </w:tcPr>
+          <w:p/>
+        </w:tc>
+      </w:tr>
+      <w:tr>
+        <w:tc>
+          <w:tcPr>
+            <w:tcW w:type="dxa" w:w="1150"/>
+            <w:tcBorders>
+              <w:top w:color="999999" w:space="0" w:sz="4" w:val="single"/>
+              <w:left w:color="999999" w:space="0" w:sz="4" w:val="single"/>
+              <w:bottom w:color="999999" w:space="0" w:sz="4" w:val="single"/>
+              <w:right w:color="999999" w:space="0" w:sz="4" w:val="single"/>
+            </w:tcBorders>
+            <w:shd w:fill="FFFFFF"/>
+          </w:tcPr>
+          <w:p/>
+        </w:tc>
+        <w:tc>
+          <w:tcPr>
+            <w:tcW w:type="dxa" w:w="1040"/>
+            <w:tcBorders>
+              <w:top w:color="999999" w:space="0" w:sz="4" w:val="single"/>
+              <w:left w:color="999999" w:space="0" w:sz="4" w:val="single"/>
+              <w:bottom w:color="999999" w:space="0" w:sz="4" w:val="single"/>
+              <w:right w:color="999999" w:space="0" w:sz="4" w:val="single"/>
+            </w:tcBorders>
+            <w:shd w:fill="FFFFFF"/>
+          </w:tcPr>
+          <w:p/>
+        </w:tc>
+        <w:tc>
+          <w:tcPr>
+            <w:tcW w:type="dxa" w:w="820"/>
+            <w:tcBorders>
+              <w:top w:color="999999" w:space="0" w:sz="4" w:val="single"/>
+              <w:left w:color="999999" w:space="0" w:sz="4" w:val="single"/>
+              <w:bottom w:color="999999" w:space="0" w:sz="4" w:val="single"/>
+              <w:right w:color="999999" w:space="0" w:sz="4" w:val="single"/>
+            </w:tcBorders>
+            <w:shd w:fill="FFFFFF"/>
+          </w:tcPr>
+          <w:p/>
+        </w:tc>
+        <w:tc>
+          <w:tcPr>
+            <w:tcW w:type="dxa" w:w="1300"/>
+            <w:tcBorders>
+              <w:top w:color="999999" w:space="0" w:sz="4" w:val="single"/>
+              <w:left w:color="999999" w:space="0" w:sz="4" w:val="single"/>
+              <w:bottom w:color="999999" w:space="0" w:sz="4" w:val="single"/>
+              <w:right w:color="999999" w:space="0" w:sz="4" w:val="single"/>
+            </w:tcBorders>
+            <w:shd w:fill="FFFFFF"/>
+          </w:tcPr>
+          <w:p/>
+        </w:tc>
+        <w:tc>
+          <w:tcPr>
+            <w:tcW w:type="dxa" w:w="1250"/>
+            <w:tcBorders>
+              <w:top w:color="999999" w:space="0" w:sz="4" w:val="single"/>
+              <w:left w:color="999999" w:space="0" w:sz="4" w:val="single"/>
+              <w:bottom w:color="999999" w:space="0" w:sz="4" w:val="single"/>
+              <w:right w:color="999999" w:space="0" w:sz="4" w:val="single"/>
+            </w:tcBorders>
+            <w:shd w:fill="FFFFFF"/>
+          </w:tcPr>
+          <w:p/>
+        </w:tc>
+        <w:tc>
+          <w:tcPr>
+            <w:tcW w:type="dxa" w:w="820"/>
+            <w:tcBorders>
+              <w:top w:color="999999" w:space="0" w:sz="4" w:val="single"/>
+              <w:left w:color="999999" w:space="0" w:sz="4" w:val="single"/>
+              <w:bottom w:color="999999" w:space="0" w:sz="4" w:val="single"/>
+              <w:right w:color="999999" w:space="0" w:sz="4" w:val="single"/>
+            </w:tcBorders>
+            <w:shd w:fill="FFFFFF"/>
+          </w:tcPr>
+          <w:p/>
+        </w:tc>
+        <w:tc>
+          <w:tcPr>
+            <w:tcW w:type="dxa" w:w="1040"/>
+            <w:tcBorders>
+              <w:top w:color="999999" w:space="0" w:sz="4" w:val="single"/>
+              <w:left w:color="999999" w:space="0" w:sz="4" w:val="single"/>
+              <w:bottom w:color="999999" w:space="0" w:sz="4" w:val="single"/>
+              <w:right w:color="999999" w:space="0" w:sz="4" w:val="single"/>
+            </w:tcBorders>
+            <w:shd w:fill="FFFFFF"/>
+          </w:tcPr>
+          <w:p/>
+        </w:tc>
+        <w:tc>
+          <w:tcPr>
+            <w:tcW w:type="dxa" w:w="1080"/>
+            <w:tcBorders>
+              <w:top w:color="999999" w:space="0" w:sz="4" w:val="single"/>
+              <w:left w:color="999999" w:space="0" w:sz="4" w:val="single"/>
+              <w:bottom w:color="999999" w:space="0" w:sz="4" w:val="single"/>
+              <w:right w:color="999999" w:space="0" w:sz="4" w:val="single"/>
+            </w:tcBorders>
+            <w:shd w:fill="FFFFFF"/>
+          </w:tcPr>
+          <w:p/>
+        </w:tc>
+        <w:tc>
+          <w:tcPr>
+            <w:tcW w:type="dxa" w:w="860"/>
             <w:tcBorders>
               <w:top w:color="999999" w:space="0" w:sz="4" w:val="single"/>
               <w:left w:color="999999" w:space="0" w:sz="4" w:val="single"/>
@@ -2131,7 +2460,7 @@
                 <w:color w:val="FFFFFF"/>
                 <w:sz w:val="26"/>
               </w:rPr>
-              <w:t>Section 2 — Probation/Parole Status</w:t>
+              <w:t>Section 3 — Probation/Parole Status</w:t>
             </w:r>
           </w:p>
         </w:tc>
@@ -2533,7 +2862,7 @@
                 <w:color w:val="FFFFFF"/>
                 <w:sz w:val="26"/>
               </w:rPr>
-              <w:t>Section 3 — Charges &amp; Exposure</w:t>
+              <w:t>Section 4 — Charges &amp; Exposure</w:t>
             </w:r>
           </w:p>
         </w:tc>
@@ -3213,7 +3542,7 @@
                 <w:color w:val="FFFFFF"/>
                 <w:sz w:val="26"/>
               </w:rPr>
-              <w:t>Section 4 — Arraignment &amp; Bail History</w:t>
+              <w:t>Section 5 — Arraignment &amp; Bail History</w:t>
             </w:r>
           </w:p>
         </w:tc>
@@ -3793,7 +4122,7 @@
                 <w:color w:val="FFFFFF"/>
                 <w:sz w:val="26"/>
               </w:rPr>
-              <w:t>Section 5 — Court Appearance Log</w:t>
+              <w:t>Section 6 — Court Appearance Log</w:t>
             </w:r>
           </w:p>
         </w:tc>
@@ -4327,7 +4656,7 @@
                 <w:color w:val="FFFFFF"/>
                 <w:sz w:val="26"/>
               </w:rPr>
-              <w:t>Section 6 — Case-Specific Defenses (Repeat for each defense)</w:t>
+              <w:t>Section 7 — Case-Specific Defenses (Repeat for each defense)</w:t>
             </w:r>
           </w:p>
         </w:tc>
@@ -4538,7 +4867,7 @@
                 <w:color w:val="FFFFFF"/>
                 <w:sz w:val="26"/>
               </w:rPr>
-              <w:t>Section 7 — Client Background</w:t>
+              <w:t>Section 8 — Client Background</w:t>
             </w:r>
           </w:p>
         </w:tc>
@@ -4805,7 +5134,7 @@
                 <w:color w:val="FFFFFF"/>
                 <w:sz w:val="26"/>
               </w:rPr>
-              <w:t>Section 8 — Plea Discussions Log</w:t>
+              <w:t>Section 9 — Plea Discussions Log</w:t>
             </w:r>
           </w:p>
         </w:tc>
@@ -5251,7 +5580,7 @@
                 <w:color w:val="FFFFFF"/>
                 <w:sz w:val="26"/>
               </w:rPr>
-              <w:t>Section 9 — Family / Friends Contact List</w:t>
+              <w:t>Section 10 — Family / Friends Contact List</w:t>
             </w:r>
           </w:p>
         </w:tc>
@@ -5873,7 +6202,7 @@
                 <w:color w:val="FFFFFF"/>
                 <w:sz w:val="26"/>
               </w:rPr>
-              <w:t>Section 10 — Key Dates &amp; Next Steps</w:t>
+              <w:t>Section 11 — Key Dates &amp; Next Steps</w:t>
             </w:r>
           </w:p>
         </w:tc>

</xml_diff>